<commit_message>
Release 0.1.0 with its archived DOI
Zenodo DOI 10.5281/zenodo.23387852 was reserved before publishing, so the
archived release can contain its own identifier rather than pointing at one
minted after the fact.

- pyproject.toml and CITATION.cff move from 0.1.0.dev0 to 0.1.0 and agree
- CITATION.cff carries the DOI and no longer says none is assigned
- the manuscript's data availability statement now cites the archive instead
  of stating that no public archive exists, and notes the accompanying SHA-256
  checksums; the CC BY-SA 3.0 scope for redistributed ChEMBL records stays
- zenodo-metadata.json gains the affiliation from the manuscript and the
  version; the ORCID field still needs the author

420 tests pass; ruff and mypy clean.

Co-Authored-By: Claude Opus 5 <noreply@anthropic.com>
</commit_message>
<xml_diff>
--- a/paper/SARscope_MolInf_manuscript.docx
+++ b/paper/SARscope_MolInf_manuscript.docx
@@ -1947,7 +1947,21 @@
     </w:p>
     <w:p>
       <w:r>
-        <w:t>A public, versioned archive and DOI for the tested revision are not yet assigned. The full benchmark snapshots and saved predictions exist only in a prepared local reproducibility archive and must be publicly deposited if the supporting modelling results are retained at submission. Redistributed ChEMBL records remain under CC BY-SA 3.0, separate from the MIT code licence.</w:t>
+        <w:t xml:space="preserve">Version 0.1.0 of the source code, together with the frozen ChEMBL 37 benchmark snapshots and the saved held-out predictions, is archived at </w:t>
+      </w:r>
+      <w:hyperlink r:id="rId11">
+        <w:r>
+          <w:rPr>
+            <w:color w:val="166C62"/>
+          </w:rPr>
+          <w:t>https://doi.org/10.5281/zenodo.23387852</w:t>
+        </w:r>
+      </w:hyperlink>
+      <w:r>
+        <w:t>.</w:t>
+      </w:r>
+      <w:r>
+        <w:t xml:space="preserve"> SHA-256 checksums for both archive files accompany the deposit. Redistributed ChEMBL records remain under CC BY-SA 3.0, separate from the MIT code licence.</w:t>
       </w:r>
     </w:p>
     <w:p>
@@ -1980,10 +1994,10 @@
                     <pic:cNvPicPr/>
                   </pic:nvPicPr>
                   <pic:blipFill>
-                    <a:blip r:embed="rId11">
+                    <a:blip r:embed="rId12">
                       <a:extLst>
                         <a:ext uri="{96DAC541-7B7A-43D3-8B79-37D633B846F1}">
-                          <asvg:svgBlip xmlns:asvg="http://schemas.microsoft.com/office/drawing/2016/SVG/main" r:embed="rId12"/>
+                          <asvg:svgBlip xmlns:asvg="http://schemas.microsoft.com/office/drawing/2016/SVG/main" r:embed="rId13"/>
                         </a:ext>
                       </a:extLst>
                     </a:blip>
@@ -2040,10 +2054,10 @@
                     <pic:cNvPicPr/>
                   </pic:nvPicPr>
                   <pic:blipFill>
-                    <a:blip r:embed="rId13">
+                    <a:blip r:embed="rId14">
                       <a:extLst>
                         <a:ext uri="{96DAC541-7B7A-43D3-8B79-37D633B846F1}">
-                          <asvg:svgBlip xmlns:asvg="http://schemas.microsoft.com/office/drawing/2016/SVG/main" r:embed="rId14"/>
+                          <asvg:svgBlip xmlns:asvg="http://schemas.microsoft.com/office/drawing/2016/SVG/main" r:embed="rId15"/>
                         </a:ext>
                       </a:extLst>
                     </a:blip>
@@ -2100,10 +2114,10 @@
                     <pic:cNvPicPr/>
                   </pic:nvPicPr>
                   <pic:blipFill>
-                    <a:blip r:embed="rId15">
+                    <a:blip r:embed="rId16">
                       <a:extLst>
                         <a:ext uri="{96DAC541-7B7A-43D3-8B79-37D633B846F1}">
-                          <asvg:svgBlip xmlns:asvg="http://schemas.microsoft.com/office/drawing/2016/SVG/main" r:embed="rId16"/>
+                          <asvg:svgBlip xmlns:asvg="http://schemas.microsoft.com/office/drawing/2016/SVG/main" r:embed="rId17"/>
                         </a:ext>
                       </a:extLst>
                     </a:blip>
@@ -2160,10 +2174,10 @@
                     <pic:cNvPicPr/>
                   </pic:nvPicPr>
                   <pic:blipFill>
-                    <a:blip r:embed="rId17">
+                    <a:blip r:embed="rId18">
                       <a:extLst>
                         <a:ext uri="{96DAC541-7B7A-43D3-8B79-37D633B846F1}">
-                          <asvg:svgBlip xmlns:asvg="http://schemas.microsoft.com/office/drawing/2016/SVG/main" r:embed="rId18"/>
+                          <asvg:svgBlip xmlns:asvg="http://schemas.microsoft.com/office/drawing/2016/SVG/main" r:embed="rId19"/>
                         </a:ext>
                       </a:extLst>
                     </a:blip>
@@ -2769,7 +2783,7 @@
       <w:r>
         <w:t xml:space="preserve"> RDKit: open-source cheminformatics, </w:t>
       </w:r>
-      <w:hyperlink r:id="rId19">
+      <w:hyperlink r:id="rId20">
         <w:r>
           <w:rPr>
             <w:color w:val="166C62"/>
@@ -2912,7 +2926,7 @@
       <w:r>
         <w:t xml:space="preserve"> Y. Boulaamane, SARscope: source-code repository, </w:t>
       </w:r>
-      <w:hyperlink r:id="rId20">
+      <w:hyperlink r:id="rId21">
         <w:r>
           <w:rPr>
             <w:color w:val="166C62"/>
@@ -2940,7 +2954,7 @@
       <w:r>
         <w:t xml:space="preserve"> Y. Boulaamane, SARscope: browser application, </w:t>
       </w:r>
-      <w:hyperlink r:id="rId21">
+      <w:hyperlink r:id="rId22">
         <w:r>
           <w:rPr>
             <w:color w:val="166C62"/>

</xml_diff>

<commit_message>
Add a plain mode to the manuscript builder
Journals typeset the article themselves, so a submission manuscript that
carries its own styling only gets in the way. --plain renders Times New Roman
12 throughout, all black: headings differ from body text by weight alone, the
running header and page-number footer are omitted, table header shading and
banded rows are dropped, inline code uses the body face, and hyperlinks are
black rather than accented.

Audited in the generated XML for both documents: a single font, no non-black
text colour, no non-white shading and no paragraph borders.

The default styled mode is unchanged for reading copies.

Co-Authored-By: Claude Opus 5 <noreply@anthropic.com>
</commit_message>
<xml_diff>
--- a/paper/SARscope_MolInf_manuscript.docx
+++ b/paper/SARscope_MolInf_manuscript.docx
@@ -57,8 +57,8 @@
       </w:r>
       <w:r>
         <w:rPr>
-          <w:rFonts w:ascii="Consolas" w:hAnsi="Consolas"/>
-          <w:sz w:val="18"/>
+          <w:rFonts w:ascii="Times New Roman" w:hAnsi="Times New Roman"/>
+          <w:sz w:val="24"/>
         </w:rPr>
         <w:t>figures/graphical-abstract.svg</w:t>
       </w:r>
@@ -534,7 +534,7 @@
         <w:tc>
           <w:tcPr>
             <w:tcW w:type="dxa" w:w="1305"/>
-            <w:shd w:fill="166C62"/>
+            <w:shd w:fill="FFFFFF"/>
           </w:tcPr>
           <w:p>
             <w:pPr>
@@ -544,8 +544,7 @@
             <w:r>
               <w:rPr>
                 <w:b/>
-                <w:color w:val="FFFFFF"/>
-                <w:sz w:val="18"/>
+                <w:sz w:val="24"/>
               </w:rPr>
               <w:t>Series</w:t>
             </w:r>
@@ -554,7 +553,7 @@
         <w:tc>
           <w:tcPr>
             <w:tcW w:type="dxa" w:w="2087"/>
-            <w:shd w:fill="166C62"/>
+            <w:shd w:fill="FFFFFF"/>
           </w:tcPr>
           <w:p>
             <w:pPr>
@@ -564,8 +563,7 @@
             <w:r>
               <w:rPr>
                 <w:b/>
-                <w:color w:val="FFFFFF"/>
-                <w:sz w:val="18"/>
+                <w:sz w:val="24"/>
               </w:rPr>
               <w:t>Curated assay compounds</w:t>
             </w:r>
@@ -574,7 +572,7 @@
         <w:tc>
           <w:tcPr>
             <w:tcW w:type="dxa" w:w="1846"/>
-            <w:shd w:fill="166C62"/>
+            <w:shd w:fill="FFFFFF"/>
           </w:tcPr>
           <w:p>
             <w:pPr>
@@ -584,8 +582,7 @@
             <w:r>
               <w:rPr>
                 <w:b/>
-                <w:color w:val="FFFFFF"/>
-                <w:sz w:val="18"/>
+                <w:sz w:val="24"/>
               </w:rPr>
               <w:t>Selected compounds</w:t>
             </w:r>
@@ -594,7 +591,7 @@
         <w:tc>
           <w:tcPr>
             <w:tcW w:type="dxa" w:w="2041"/>
-            <w:shd w:fill="166C62"/>
+            <w:shd w:fill="FFFFFF"/>
           </w:tcPr>
           <w:p>
             <w:pPr>
@@ -604,8 +601,7 @@
             <w:r>
               <w:rPr>
                 <w:b/>
-                <w:color w:val="FFFFFF"/>
-                <w:sz w:val="18"/>
+                <w:sz w:val="24"/>
               </w:rPr>
               <w:t>Positional comparisons</w:t>
             </w:r>
@@ -614,7 +610,7 @@
         <w:tc>
           <w:tcPr>
             <w:tcW w:type="dxa" w:w="2132"/>
-            <w:shd w:fill="166C62"/>
+            <w:shd w:fill="FFFFFF"/>
           </w:tcPr>
           <w:p>
             <w:pPr>
@@ -624,8 +620,7 @@
             <w:r>
               <w:rPr>
                 <w:b/>
-                <w:color w:val="FFFFFF"/>
-                <w:sz w:val="18"/>
+                <w:sz w:val="24"/>
               </w:rPr>
               <w:t>Distinct transformations</w:t>
             </w:r>
@@ -639,7 +634,7 @@
         <w:tc>
           <w:tcPr>
             <w:tcW w:type="dxa" w:w="1305"/>
-            <w:shd w:fill="EDF5F3"/>
+            <w:shd w:fill="FFFFFF"/>
           </w:tcPr>
           <w:p>
             <w:pPr>
@@ -648,7 +643,7 @@
             </w:pPr>
             <w:r>
               <w:rPr>
-                <w:sz w:val="18"/>
+                <w:sz w:val="24"/>
               </w:rPr>
               <w:t>BRAF</w:t>
             </w:r>
@@ -657,7 +652,7 @@
         <w:tc>
           <w:tcPr>
             <w:tcW w:type="dxa" w:w="2087"/>
-            <w:shd w:fill="EDF5F3"/>
+            <w:shd w:fill="FFFFFF"/>
           </w:tcPr>
           <w:p>
             <w:pPr>
@@ -666,7 +661,7 @@
             </w:pPr>
             <w:r>
               <w:rPr>
-                <w:sz w:val="18"/>
+                <w:sz w:val="24"/>
               </w:rPr>
               <w:t>44</w:t>
             </w:r>
@@ -675,7 +670,7 @@
         <w:tc>
           <w:tcPr>
             <w:tcW w:type="dxa" w:w="1846"/>
-            <w:shd w:fill="EDF5F3"/>
+            <w:shd w:fill="FFFFFF"/>
           </w:tcPr>
           <w:p>
             <w:pPr>
@@ -684,7 +679,7 @@
             </w:pPr>
             <w:r>
               <w:rPr>
-                <w:sz w:val="18"/>
+                <w:sz w:val="24"/>
               </w:rPr>
               <w:t>16</w:t>
             </w:r>
@@ -693,7 +688,7 @@
         <w:tc>
           <w:tcPr>
             <w:tcW w:type="dxa" w:w="2041"/>
-            <w:shd w:fill="EDF5F3"/>
+            <w:shd w:fill="FFFFFF"/>
           </w:tcPr>
           <w:p>
             <w:pPr>
@@ -702,7 +697,7 @@
             </w:pPr>
             <w:r>
               <w:rPr>
-                <w:sz w:val="18"/>
+                <w:sz w:val="24"/>
               </w:rPr>
               <w:t>29</w:t>
             </w:r>
@@ -711,7 +706,7 @@
         <w:tc>
           <w:tcPr>
             <w:tcW w:type="dxa" w:w="2132"/>
-            <w:shd w:fill="EDF5F3"/>
+            <w:shd w:fill="FFFFFF"/>
           </w:tcPr>
           <w:p>
             <w:pPr>
@@ -720,7 +715,7 @@
             </w:pPr>
             <w:r>
               <w:rPr>
-                <w:sz w:val="18"/>
+                <w:sz w:val="24"/>
               </w:rPr>
               <w:t>15</w:t>
             </w:r>
@@ -743,7 +738,7 @@
             </w:pPr>
             <w:r>
               <w:rPr>
-                <w:sz w:val="18"/>
+                <w:sz w:val="24"/>
               </w:rPr>
               <w:t>DRD2</w:t>
             </w:r>
@@ -761,7 +756,7 @@
             </w:pPr>
             <w:r>
               <w:rPr>
-                <w:sz w:val="18"/>
+                <w:sz w:val="24"/>
               </w:rPr>
               <w:t>30</w:t>
             </w:r>
@@ -779,7 +774,7 @@
             </w:pPr>
             <w:r>
               <w:rPr>
-                <w:sz w:val="18"/>
+                <w:sz w:val="24"/>
               </w:rPr>
               <w:t>23</w:t>
             </w:r>
@@ -797,7 +792,7 @@
             </w:pPr>
             <w:r>
               <w:rPr>
-                <w:sz w:val="18"/>
+                <w:sz w:val="24"/>
               </w:rPr>
               <w:t>36</w:t>
             </w:r>
@@ -815,7 +810,7 @@
             </w:pPr>
             <w:r>
               <w:rPr>
-                <w:sz w:val="18"/>
+                <w:sz w:val="24"/>
               </w:rPr>
               <w:t>21</w:t>
             </w:r>
@@ -829,7 +824,7 @@
         <w:tc>
           <w:tcPr>
             <w:tcW w:type="dxa" w:w="1305"/>
-            <w:shd w:fill="EDF5F3"/>
+            <w:shd w:fill="FFFFFF"/>
           </w:tcPr>
           <w:p>
             <w:pPr>
@@ -838,7 +833,7 @@
             </w:pPr>
             <w:r>
               <w:rPr>
-                <w:sz w:val="18"/>
+                <w:sz w:val="24"/>
               </w:rPr>
               <w:t>ER-alpha</w:t>
             </w:r>
@@ -847,7 +842,7 @@
         <w:tc>
           <w:tcPr>
             <w:tcW w:type="dxa" w:w="2087"/>
-            <w:shd w:fill="EDF5F3"/>
+            <w:shd w:fill="FFFFFF"/>
           </w:tcPr>
           <w:p>
             <w:pPr>
@@ -856,7 +851,7 @@
             </w:pPr>
             <w:r>
               <w:rPr>
-                <w:sz w:val="18"/>
+                <w:sz w:val="24"/>
               </w:rPr>
               <w:t>98</w:t>
             </w:r>
@@ -865,7 +860,7 @@
         <w:tc>
           <w:tcPr>
             <w:tcW w:type="dxa" w:w="1846"/>
-            <w:shd w:fill="EDF5F3"/>
+            <w:shd w:fill="FFFFFF"/>
           </w:tcPr>
           <w:p>
             <w:pPr>
@@ -874,7 +869,7 @@
             </w:pPr>
             <w:r>
               <w:rPr>
-                <w:sz w:val="18"/>
+                <w:sz w:val="24"/>
               </w:rPr>
               <w:t>53</w:t>
             </w:r>
@@ -883,7 +878,7 @@
         <w:tc>
           <w:tcPr>
             <w:tcW w:type="dxa" w:w="2041"/>
-            <w:shd w:fill="EDF5F3"/>
+            <w:shd w:fill="FFFFFF"/>
           </w:tcPr>
           <w:p>
             <w:pPr>
@@ -892,7 +887,7 @@
             </w:pPr>
             <w:r>
               <w:rPr>
-                <w:sz w:val="18"/>
+                <w:sz w:val="24"/>
               </w:rPr>
               <w:t>198</w:t>
             </w:r>
@@ -901,7 +896,7 @@
         <w:tc>
           <w:tcPr>
             <w:tcW w:type="dxa" w:w="2132"/>
-            <w:shd w:fill="EDF5F3"/>
+            <w:shd w:fill="FFFFFF"/>
           </w:tcPr>
           <w:p>
             <w:pPr>
@@ -910,7 +905,7 @@
             </w:pPr>
             <w:r>
               <w:rPr>
-                <w:sz w:val="18"/>
+                <w:sz w:val="24"/>
               </w:rPr>
               <w:t>155</w:t>
             </w:r>
@@ -1054,7 +1049,7 @@
         <w:tc>
           <w:tcPr>
             <w:tcW w:type="dxa" w:w="1412"/>
-            <w:shd w:fill="166C62"/>
+            <w:shd w:fill="FFFFFF"/>
           </w:tcPr>
           <w:p>
             <w:pPr>
@@ -1064,8 +1059,7 @@
             <w:r>
               <w:rPr>
                 <w:b/>
-                <w:color w:val="FFFFFF"/>
-                <w:sz w:val="18"/>
+                <w:sz w:val="24"/>
               </w:rPr>
               <w:t>Series</w:t>
             </w:r>
@@ -1074,7 +1068,7 @@
         <w:tc>
           <w:tcPr>
             <w:tcW w:type="dxa" w:w="2353"/>
-            <w:shd w:fill="166C62"/>
+            <w:shd w:fill="FFFFFF"/>
           </w:tcPr>
           <w:p>
             <w:pPr>
@@ -1084,8 +1078,7 @@
             <w:r>
               <w:rPr>
                 <w:b/>
-                <w:color w:val="FFFFFF"/>
-                <w:sz w:val="18"/>
+                <w:sz w:val="24"/>
               </w:rPr>
               <w:t>Evaluated transformations</w:t>
             </w:r>
@@ -1094,7 +1087,7 @@
         <w:tc>
           <w:tcPr>
             <w:tcW w:type="dxa" w:w="2823"/>
-            <w:shd w:fill="166C62"/>
+            <w:shd w:fill="FFFFFF"/>
           </w:tcPr>
           <w:p>
             <w:pPr>
@@ -1104,8 +1097,7 @@
             <w:r>
               <w:rPr>
                 <w:b/>
-                <w:color w:val="FFFFFF"/>
-                <w:sz w:val="18"/>
+                <w:sz w:val="24"/>
               </w:rPr>
               <w:t>Median sign retained after compound omissions</w:t>
             </w:r>
@@ -1114,7 +1106,7 @@
         <w:tc>
           <w:tcPr>
             <w:tcW w:type="dxa" w:w="2823"/>
-            <w:shd w:fill="166C62"/>
+            <w:shd w:fill="FFFFFF"/>
           </w:tcPr>
           <w:p>
             <w:pPr>
@@ -1124,8 +1116,7 @@
             <w:r>
               <w:rPr>
                 <w:b/>
-                <w:color w:val="FFFFFF"/>
-                <w:sz w:val="18"/>
+                <w:sz w:val="24"/>
               </w:rPr>
               <w:t>Full directional criterion retained in tested nonempty subsets</w:t>
             </w:r>
@@ -1139,7 +1130,7 @@
         <w:tc>
           <w:tcPr>
             <w:tcW w:type="dxa" w:w="1412"/>
-            <w:shd w:fill="EDF5F3"/>
+            <w:shd w:fill="FFFFFF"/>
           </w:tcPr>
           <w:p>
             <w:pPr>
@@ -1148,7 +1139,7 @@
             </w:pPr>
             <w:r>
               <w:rPr>
-                <w:sz w:val="18"/>
+                <w:sz w:val="24"/>
               </w:rPr>
               <w:t>BRAF</w:t>
             </w:r>
@@ -1157,7 +1148,7 @@
         <w:tc>
           <w:tcPr>
             <w:tcW w:type="dxa" w:w="2353"/>
-            <w:shd w:fill="EDF5F3"/>
+            <w:shd w:fill="FFFFFF"/>
           </w:tcPr>
           <w:p>
             <w:pPr>
@@ -1166,7 +1157,7 @@
             </w:pPr>
             <w:r>
               <w:rPr>
-                <w:sz w:val="18"/>
+                <w:sz w:val="24"/>
               </w:rPr>
               <w:t>5</w:t>
             </w:r>
@@ -1175,7 +1166,7 @@
         <w:tc>
           <w:tcPr>
             <w:tcW w:type="dxa" w:w="2823"/>
-            <w:shd w:fill="EDF5F3"/>
+            <w:shd w:fill="FFFFFF"/>
           </w:tcPr>
           <w:p>
             <w:pPr>
@@ -1184,7 +1175,7 @@
             </w:pPr>
             <w:r>
               <w:rPr>
-                <w:sz w:val="18"/>
+                <w:sz w:val="24"/>
               </w:rPr>
               <w:t>5</w:t>
             </w:r>
@@ -1193,7 +1184,7 @@
         <w:tc>
           <w:tcPr>
             <w:tcW w:type="dxa" w:w="2823"/>
-            <w:shd w:fill="EDF5F3"/>
+            <w:shd w:fill="FFFFFF"/>
           </w:tcPr>
           <w:p>
             <w:pPr>
@@ -1202,7 +1193,7 @@
             </w:pPr>
             <w:r>
               <w:rPr>
-                <w:sz w:val="18"/>
+                <w:sz w:val="24"/>
               </w:rPr>
               <w:t>4</w:t>
             </w:r>
@@ -1225,7 +1216,7 @@
             </w:pPr>
             <w:r>
               <w:rPr>
-                <w:sz w:val="18"/>
+                <w:sz w:val="24"/>
               </w:rPr>
               <w:t>DRD2</w:t>
             </w:r>
@@ -1243,7 +1234,7 @@
             </w:pPr>
             <w:r>
               <w:rPr>
-                <w:sz w:val="18"/>
+                <w:sz w:val="24"/>
               </w:rPr>
               <w:t>5</w:t>
             </w:r>
@@ -1261,7 +1252,7 @@
             </w:pPr>
             <w:r>
               <w:rPr>
-                <w:sz w:val="18"/>
+                <w:sz w:val="24"/>
               </w:rPr>
               <w:t>5</w:t>
             </w:r>
@@ -1279,7 +1270,7 @@
             </w:pPr>
             <w:r>
               <w:rPr>
-                <w:sz w:val="18"/>
+                <w:sz w:val="24"/>
               </w:rPr>
               <w:t>5</w:t>
             </w:r>
@@ -1293,7 +1284,7 @@
         <w:tc>
           <w:tcPr>
             <w:tcW w:type="dxa" w:w="1412"/>
-            <w:shd w:fill="EDF5F3"/>
+            <w:shd w:fill="FFFFFF"/>
           </w:tcPr>
           <w:p>
             <w:pPr>
@@ -1302,7 +1293,7 @@
             </w:pPr>
             <w:r>
               <w:rPr>
-                <w:sz w:val="18"/>
+                <w:sz w:val="24"/>
               </w:rPr>
               <w:t>ER-alpha</w:t>
             </w:r>
@@ -1311,7 +1302,7 @@
         <w:tc>
           <w:tcPr>
             <w:tcW w:type="dxa" w:w="2353"/>
-            <w:shd w:fill="EDF5F3"/>
+            <w:shd w:fill="FFFFFF"/>
           </w:tcPr>
           <w:p>
             <w:pPr>
@@ -1320,7 +1311,7 @@
             </w:pPr>
             <w:r>
               <w:rPr>
-                <w:sz w:val="18"/>
+                <w:sz w:val="24"/>
               </w:rPr>
               <w:t>7</w:t>
             </w:r>
@@ -1329,7 +1320,7 @@
         <w:tc>
           <w:tcPr>
             <w:tcW w:type="dxa" w:w="2823"/>
-            <w:shd w:fill="EDF5F3"/>
+            <w:shd w:fill="FFFFFF"/>
           </w:tcPr>
           <w:p>
             <w:pPr>
@@ -1338,7 +1329,7 @@
             </w:pPr>
             <w:r>
               <w:rPr>
-                <w:sz w:val="18"/>
+                <w:sz w:val="24"/>
               </w:rPr>
               <w:t>7</w:t>
             </w:r>
@@ -1347,7 +1338,7 @@
         <w:tc>
           <w:tcPr>
             <w:tcW w:type="dxa" w:w="2823"/>
-            <w:shd w:fill="EDF5F3"/>
+            <w:shd w:fill="FFFFFF"/>
           </w:tcPr>
           <w:p>
             <w:pPr>
@@ -1356,7 +1347,7 @@
             </w:pPr>
             <w:r>
               <w:rPr>
-                <w:sz w:val="18"/>
+                <w:sz w:val="24"/>
               </w:rPr>
               <w:t>6</w:t>
             </w:r>
@@ -1379,7 +1370,7 @@
             </w:pPr>
             <w:r>
               <w:rPr>
-                <w:sz w:val="18"/>
+                <w:sz w:val="24"/>
               </w:rPr>
               <w:t>Total</w:t>
             </w:r>
@@ -1397,7 +1388,7 @@
             </w:pPr>
             <w:r>
               <w:rPr>
-                <w:sz w:val="18"/>
+                <w:sz w:val="24"/>
               </w:rPr>
               <w:t>17</w:t>
             </w:r>
@@ -1415,7 +1406,7 @@
             </w:pPr>
             <w:r>
               <w:rPr>
-                <w:sz w:val="18"/>
+                <w:sz w:val="24"/>
               </w:rPr>
               <w:t>17</w:t>
             </w:r>
@@ -1433,7 +1424,7 @@
             </w:pPr>
             <w:r>
               <w:rPr>
-                <w:sz w:val="18"/>
+                <w:sz w:val="24"/>
               </w:rPr>
               <w:t>15</w:t>
             </w:r>
@@ -1949,10 +1940,10 @@
       <w:r>
         <w:t xml:space="preserve">Version 0.1.0 of the source code is released at </w:t>
       </w:r>
-      <w:hyperlink r:id="rId11">
+      <w:hyperlink r:id="rId9">
         <w:r>
           <w:rPr>
-            <w:color w:val="166C62"/>
+            <w:color w:val="000000"/>
           </w:rPr>
           <w:t>https://github.com/yboulaamane/sarscope/releases/tag/v0.1.0</w:t>
         </w:r>
@@ -1965,8 +1956,8 @@
       </w:r>
       <w:r>
         <w:rPr>
-          <w:rFonts w:ascii="Consolas" w:hAnsi="Consolas"/>
-          <w:sz w:val="18"/>
+          <w:rFonts w:ascii="Times New Roman" w:hAnsi="Times New Roman"/>
+          <w:sz w:val="24"/>
         </w:rPr>
         <w:t>paper/benchmark-chembl37.tar.gz</w:t>
       </w:r>
@@ -1993,6 +1984,66 @@
           <wp:inline xmlns:a="http://schemas.openxmlformats.org/drawingml/2006/main" xmlns:pic="http://schemas.openxmlformats.org/drawingml/2006/picture">
             <wp:extent cx="5976000" cy="1949095"/>
             <wp:docPr id="1" name="Picture 1" descr="Figure 1. Workflow for challenging an observed positional SAR conclusion. The chemist selects a transformation, inspects the controlled assay evidence, tests sensitivity to retained records and thresholds, and examines contexts or missing-cycle measurements. The exported evidence card preserves the observations, decisions and limitations. Follow-up suggestions are unmeasured hypotheses, not predicted potency gains."/>
+            <wp:cNvGraphicFramePr>
+              <a:graphicFrameLocks noChangeAspect="1"/>
+            </wp:cNvGraphicFramePr>
+            <a:graphic>
+              <a:graphicData uri="http://schemas.openxmlformats.org/drawingml/2006/picture">
+                <pic:pic>
+                  <pic:nvPicPr>
+                    <pic:cNvPr id="0" name="image.png"/>
+                    <pic:cNvPicPr/>
+                  </pic:nvPicPr>
+                  <pic:blipFill>
+                    <a:blip r:embed="rId10">
+                      <a:extLst>
+                        <a:ext uri="{96DAC541-7B7A-43D3-8B79-37D633B846F1}">
+                          <asvg:svgBlip xmlns:asvg="http://schemas.microsoft.com/office/drawing/2016/SVG/main" r:embed="rId11"/>
+                        </a:ext>
+                      </a:extLst>
+                    </a:blip>
+                    <a:stretch>
+                      <a:fillRect/>
+                    </a:stretch>
+                  </pic:blipFill>
+                  <pic:spPr>
+                    <a:xfrm>
+                      <a:off x="0" y="0"/>
+                      <a:ext cx="5976000" cy="1949095"/>
+                    </a:xfrm>
+                    <a:prstGeom prst="rect"/>
+                  </pic:spPr>
+                </pic:pic>
+              </a:graphicData>
+            </a:graphic>
+          </wp:inline>
+        </w:drawing>
+      </w:r>
+    </w:p>
+    <w:p>
+      <w:pPr>
+        <w:pStyle w:val="Caption"/>
+      </w:pPr>
+      <w:r>
+        <w:t>Figure 1. Workflow for challenging an observed positional SAR conclusion. The chemist selects a transformation, inspects the controlled assay evidence, tests sensitivity to retained records and thresholds, and examines contexts or missing-cycle measurements. The exported evidence card preserves the observations, decisions and limitations. Follow-up suggestions are unmeasured hypotheses, not predicted potency gains.</w:t>
+      </w:r>
+    </w:p>
+    <w:p>
+      <w:r>
+        <w:br w:type="page"/>
+      </w:r>
+    </w:p>
+    <w:p>
+      <w:pPr>
+        <w:keepNext/>
+        <w:spacing w:after="120"/>
+        <w:jc w:val="center"/>
+      </w:pPr>
+      <w:r>
+        <w:drawing>
+          <wp:inline xmlns:a="http://schemas.openxmlformats.org/drawingml/2006/main" xmlns:pic="http://schemas.openxmlformats.org/drawingml/2006/picture">
+            <wp:extent cx="5976000" cy="3640763"/>
+            <wp:docPr id="2" name="Picture 2" descr="Figure 2. Interactive positional SAR map for the BRAF series. The shared structure, variable positions and example transformations are shown together. Labels describe the measured comparisons and the software's support criteria, not statistical significance or a binding mechanism. Selecting a position in the application opens its supporting compounds and assay records."/>
             <wp:cNvGraphicFramePr>
               <a:graphicFrameLocks noChangeAspect="1"/>
             </wp:cNvGraphicFramePr>
@@ -2018,7 +2069,7 @@
                   <pic:spPr>
                     <a:xfrm>
                       <a:off x="0" y="0"/>
-                      <a:ext cx="5976000" cy="1949095"/>
+                      <a:ext cx="5976000" cy="3640763"/>
                     </a:xfrm>
                     <a:prstGeom prst="rect"/>
                   </pic:spPr>
@@ -2034,7 +2085,7 @@
         <w:pStyle w:val="Caption"/>
       </w:pPr>
       <w:r>
-        <w:t>Figure 1. Workflow for challenging an observed positional SAR conclusion. The chemist selects a transformation, inspects the controlled assay evidence, tests sensitivity to retained records and thresholds, and examines contexts or missing-cycle measurements. The exported evidence card preserves the observations, decisions and limitations. Follow-up suggestions are unmeasured hypotheses, not predicted potency gains.</w:t>
+        <w:t>Figure 2. Interactive positional SAR map for the BRAF series. The shared structure, variable positions and example transformations are shown together. Labels describe the measured comparisons and the software's support criteria, not statistical significance or a binding mechanism. Selecting a position in the application opens its supporting compounds and assay records.</w:t>
       </w:r>
     </w:p>
     <w:p>
@@ -2051,8 +2102,8 @@
       <w:r>
         <w:drawing>
           <wp:inline xmlns:a="http://schemas.openxmlformats.org/drawingml/2006/main" xmlns:pic="http://schemas.openxmlformats.org/drawingml/2006/picture">
-            <wp:extent cx="5976000" cy="3640763"/>
-            <wp:docPr id="2" name="Picture 2" descr="Figure 2. Interactive positional SAR map for the BRAF series. The shared structure, variable positions and example transformations are shown together. Labels describe the measured comparisons and the software's support criteria, not statistical significance or a binding mechanism. Selecting a position in the application opens its supporting compounds and assay records."/>
+            <wp:extent cx="5976000" cy="3452289"/>
+            <wp:docPr id="3" name="Picture 3" descr="Figure 3. Individual pair effects for selected BRAF, DRD2 and ER-alpha transformations. Circles show measured pair differences; diamonds show their medians. Thick pale segments show the range of medians after omitting individual compounds and all their incident pairs, not confidence intervals. The grey band marks changes smaller than 0.5 pIC50 units. The number of pairs is shown for each transformation. All displayed DRD2 pairs have the same selected stereochemical core. The displayed examples were chosen to illustrate positional contrasts and repeated comparisons, not as an exhaustive ranking of transformations."/>
             <wp:cNvGraphicFramePr>
               <a:graphicFrameLocks noChangeAspect="1"/>
             </wp:cNvGraphicFramePr>
@@ -2078,7 +2129,7 @@
                   <pic:spPr>
                     <a:xfrm>
                       <a:off x="0" y="0"/>
-                      <a:ext cx="5976000" cy="3640763"/>
+                      <a:ext cx="5976000" cy="3452289"/>
                     </a:xfrm>
                     <a:prstGeom prst="rect"/>
                   </pic:spPr>
@@ -2094,7 +2145,7 @@
         <w:pStyle w:val="Caption"/>
       </w:pPr>
       <w:r>
-        <w:t>Figure 2. Interactive positional SAR map for the BRAF series. The shared structure, variable positions and example transformations are shown together. Labels describe the measured comparisons and the software's support criteria, not statistical significance or a binding mechanism. Selecting a position in the application opens its supporting compounds and assay records.</w:t>
+        <w:t>Figure 3. Individual pair effects for selected BRAF, DRD2 and ER-alpha transformations. Circles show measured pair differences; diamonds show their medians. Thick pale segments show the range of medians after omitting individual compounds and all their incident pairs, not confidence intervals. The grey band marks changes smaller than 0.5 pIC50 units. The number of pairs is shown for each transformation. All displayed DRD2 pairs have the same selected stereochemical core. The displayed examples were chosen to illustrate positional contrasts and repeated comparisons, not as an exhaustive ranking of transformations.</w:t>
       </w:r>
     </w:p>
     <w:p>
@@ -2111,8 +2162,8 @@
       <w:r>
         <w:drawing>
           <wp:inline xmlns:a="http://schemas.openxmlformats.org/drawingml/2006/main" xmlns:pic="http://schemas.openxmlformats.org/drawingml/2006/picture">
-            <wp:extent cx="5976000" cy="3452289"/>
-            <wp:docPr id="3" name="Picture 3" descr="Figure 3. Individual pair effects for selected BRAF, DRD2 and ER-alpha transformations. Circles show measured pair differences; diamonds show their medians. Thick pale segments show the range of medians after omitting individual compounds and all their incident pairs, not confidence intervals. The grey band marks changes smaller than 0.5 pIC50 units. The number of pairs is shown for each transformation. All displayed DRD2 pairs have the same selected stereochemical core. The displayed examples were chosen to illustrate positional contrasts and repeated comparisons, not as an exhaustive ranking of transformations."/>
+            <wp:extent cx="5976000" cy="4376271"/>
+            <wp:docPr id="4" name="Picture 4" descr="Figure 4. Complete DRD2 para/ortho chlorination cycle within the selected (S,S) core. Other mapped positions are unchanged and all measurements come from CHEMBL671074. Structures and original IC50 values are shown; the doubly chlorinated compound has retained values of 65 and 93 nM. Arrows show differences calculated from median pIC50. The −0.369-unit contrast describes a modest departure from additivity, not a binding free energy or evidence of biological cooperativity."/>
             <wp:cNvGraphicFramePr>
               <a:graphicFrameLocks noChangeAspect="1"/>
             </wp:cNvGraphicFramePr>
@@ -2138,66 +2189,6 @@
                   <pic:spPr>
                     <a:xfrm>
                       <a:off x="0" y="0"/>
-                      <a:ext cx="5976000" cy="3452289"/>
-                    </a:xfrm>
-                    <a:prstGeom prst="rect"/>
-                  </pic:spPr>
-                </pic:pic>
-              </a:graphicData>
-            </a:graphic>
-          </wp:inline>
-        </w:drawing>
-      </w:r>
-    </w:p>
-    <w:p>
-      <w:pPr>
-        <w:pStyle w:val="Caption"/>
-      </w:pPr>
-      <w:r>
-        <w:t>Figure 3. Individual pair effects for selected BRAF, DRD2 and ER-alpha transformations. Circles show measured pair differences; diamonds show their medians. Thick pale segments show the range of medians after omitting individual compounds and all their incident pairs, not confidence intervals. The grey band marks changes smaller than 0.5 pIC50 units. The number of pairs is shown for each transformation. All displayed DRD2 pairs have the same selected stereochemical core. The displayed examples were chosen to illustrate positional contrasts and repeated comparisons, not as an exhaustive ranking of transformations.</w:t>
-      </w:r>
-    </w:p>
-    <w:p>
-      <w:r>
-        <w:br w:type="page"/>
-      </w:r>
-    </w:p>
-    <w:p>
-      <w:pPr>
-        <w:keepNext/>
-        <w:spacing w:after="120"/>
-        <w:jc w:val="center"/>
-      </w:pPr>
-      <w:r>
-        <w:drawing>
-          <wp:inline xmlns:a="http://schemas.openxmlformats.org/drawingml/2006/main" xmlns:pic="http://schemas.openxmlformats.org/drawingml/2006/picture">
-            <wp:extent cx="5976000" cy="4376271"/>
-            <wp:docPr id="4" name="Picture 4" descr="Figure 4. Complete DRD2 para/ortho chlorination cycle within the selected (S,S) core. Other mapped positions are unchanged and all measurements come from CHEMBL671074. Structures and original IC50 values are shown; the doubly chlorinated compound has retained values of 65 and 93 nM. Arrows show differences calculated from median pIC50. The −0.369-unit contrast describes a modest departure from additivity, not a binding free energy or evidence of biological cooperativity."/>
-            <wp:cNvGraphicFramePr>
-              <a:graphicFrameLocks noChangeAspect="1"/>
-            </wp:cNvGraphicFramePr>
-            <a:graphic>
-              <a:graphicData uri="http://schemas.openxmlformats.org/drawingml/2006/picture">
-                <pic:pic>
-                  <pic:nvPicPr>
-                    <pic:cNvPr id="0" name="image.png"/>
-                    <pic:cNvPicPr/>
-                  </pic:nvPicPr>
-                  <pic:blipFill>
-                    <a:blip r:embed="rId18">
-                      <a:extLst>
-                        <a:ext uri="{96DAC541-7B7A-43D3-8B79-37D633B846F1}">
-                          <asvg:svgBlip xmlns:asvg="http://schemas.microsoft.com/office/drawing/2016/SVG/main" r:embed="rId19"/>
-                        </a:ext>
-                      </a:extLst>
-                    </a:blip>
-                    <a:stretch>
-                      <a:fillRect/>
-                    </a:stretch>
-                  </pic:blipFill>
-                  <pic:spPr>
-                    <a:xfrm>
-                      <a:off x="0" y="0"/>
                       <a:ext cx="5976000" cy="4376271"/>
                     </a:xfrm>
                     <a:prstGeom prst="rect"/>
@@ -2793,10 +2784,10 @@
       <w:r>
         <w:t xml:space="preserve"> RDKit: open-source cheminformatics, </w:t>
       </w:r>
-      <w:hyperlink r:id="rId20">
+      <w:hyperlink r:id="rId18">
         <w:r>
           <w:rPr>
-            <w:color w:val="166C62"/>
+            <w:color w:val="000000"/>
           </w:rPr>
           <w:t>https://www.rdkit.org/</w:t>
         </w:r>
@@ -2936,10 +2927,10 @@
       <w:r>
         <w:t xml:space="preserve"> Y. Boulaamane, SARscope: source-code repository, </w:t>
       </w:r>
-      <w:hyperlink r:id="rId21">
+      <w:hyperlink r:id="rId19">
         <w:r>
           <w:rPr>
-            <w:color w:val="166C62"/>
+            <w:color w:val="000000"/>
           </w:rPr>
           <w:t>https://github.com/yboulaamane/sarscope</w:t>
         </w:r>
@@ -2964,10 +2955,10 @@
       <w:r>
         <w:t xml:space="preserve"> Y. Boulaamane, SARscope: browser application, </w:t>
       </w:r>
-      <w:hyperlink r:id="rId22">
+      <w:hyperlink r:id="rId20">
         <w:r>
           <w:rPr>
-            <w:color w:val="166C62"/>
+            <w:color w:val="000000"/>
           </w:rPr>
           <w:t>https://sarscope.streamlit.app/</w:t>
         </w:r>
@@ -2980,8 +2971,6 @@
       </w:r>
     </w:p>
     <w:sectPr>
-      <w:headerReference w:type="default" r:id="rId9"/>
-      <w:footerReference w:type="default" r:id="rId10"/>
       <w:pgSz w:w="11906" w:h="16838"/>
       <w:pgMar w:top="1247" w:right="1247" w:bottom="1247" w:left="1247" w:header="567" w:footer="567" w:gutter="0"/>
       <w:cols w:space="720"/>
@@ -2989,35 +2978,6 @@
     </w:sectPr>
   </w:body>
 </w:document>
-</file>
-
-<file path=word/footer1.xml><?xml version="1.0" encoding="utf-8"?>
-<w:ftr xmlns:m="http://schemas.openxmlformats.org/officeDocument/2006/math" xmlns:mc="http://schemas.openxmlformats.org/markup-compatibility/2006" xmlns:mo="http://schemas.microsoft.com/office/mac/office/2008/main" xmlns:mv="urn:schemas-microsoft-com:mac:vml" xmlns:o="urn:schemas-microsoft-com:office:office" xmlns:r="http://schemas.openxmlformats.org/officeDocument/2006/relationships" xmlns:v="urn:schemas-microsoft-com:vml" xmlns:w10="urn:schemas-microsoft-com:office:word" xmlns:w14="http://schemas.microsoft.com/office/word/2010/wordml" xmlns:w="http://schemas.openxmlformats.org/wordprocessingml/2006/main" xmlns:wne="http://schemas.microsoft.com/office/word/2006/wordml" xmlns:wp14="http://schemas.microsoft.com/office/word/2010/wordprocessingDrawing" xmlns:wp="http://schemas.openxmlformats.org/drawingml/2006/wordprocessingDrawing" xmlns:wpc="http://schemas.microsoft.com/office/word/2010/wordprocessingCanvas" xmlns:wpg="http://schemas.microsoft.com/office/word/2010/wordprocessingGroup" xmlns:wpi="http://schemas.microsoft.com/office/word/2010/wordprocessingInk" xmlns:wps="http://schemas.microsoft.com/office/word/2010/wordprocessingShape" mc:Ignorable="w14 wp14">
-  <w:p>
-    <w:pPr>
-      <w:pStyle w:val="Footer"/>
-      <w:jc w:val="right"/>
-    </w:pPr>
-    <w:fldSimple w:instr="PAGE"/>
-  </w:p>
-</w:ftr>
-</file>
-
-<file path=word/header1.xml><?xml version="1.0" encoding="utf-8"?>
-<w:hdr xmlns:m="http://schemas.openxmlformats.org/officeDocument/2006/math" xmlns:mc="http://schemas.openxmlformats.org/markup-compatibility/2006" xmlns:mo="http://schemas.microsoft.com/office/mac/office/2008/main" xmlns:mv="urn:schemas-microsoft-com:mac:vml" xmlns:o="urn:schemas-microsoft-com:office:office" xmlns:r="http://schemas.openxmlformats.org/officeDocument/2006/relationships" xmlns:v="urn:schemas-microsoft-com:vml" xmlns:w10="urn:schemas-microsoft-com:office:word" xmlns:w14="http://schemas.microsoft.com/office/word/2010/wordml" xmlns:w="http://schemas.openxmlformats.org/wordprocessingml/2006/main" xmlns:wne="http://schemas.microsoft.com/office/word/2006/wordml" xmlns:wp14="http://schemas.microsoft.com/office/word/2010/wordprocessingDrawing" xmlns:wp="http://schemas.openxmlformats.org/drawingml/2006/wordprocessingDrawing" xmlns:wpc="http://schemas.microsoft.com/office/word/2010/wordprocessingCanvas" xmlns:wpg="http://schemas.microsoft.com/office/word/2010/wordprocessingGroup" xmlns:wpi="http://schemas.microsoft.com/office/word/2010/wordprocessingInk" xmlns:wps="http://schemas.microsoft.com/office/word/2010/wordprocessingShape" mc:Ignorable="w14 wp14">
-  <w:p>
-    <w:pPr>
-      <w:pStyle w:val="Header"/>
-    </w:pPr>
-    <w:r>
-      <w:rPr>
-        <w:color w:val="6A7784"/>
-        <w:sz w:val="16"/>
-      </w:rPr>
-      <w:t>SARscope · Manuscript draft</w:t>
-    </w:r>
-  </w:p>
-</w:hdr>
 </file>
 
 <file path=word/numbering.xml><?xml version="1.0" encoding="utf-8"?>
@@ -3385,11 +3345,12 @@
     <w:rsid w:val="00FC693F"/>
     <w:pPr>
       <w:widowControl/>
-      <w:spacing w:line="264" w:lineRule="auto" w:after="120"/>
+      <w:spacing w:line="240" w:lineRule="auto" w:after="0" w:before="0"/>
     </w:pPr>
     <w:rPr>
-      <w:rFonts w:ascii="Calibri" w:hAnsi="Calibri"/>
-      <w:sz w:val="22"/>
+      <w:rFonts w:ascii="Times New Roman" w:hAnsi="Times New Roman"/>
+      <w:color w:val="000000"/>
+      <w:sz w:val="24"/>
     </w:rPr>
   </w:style>
   <w:style w:type="paragraph" w:styleId="Header">
@@ -3447,15 +3408,15 @@
     <w:pPr>
       <w:keepNext/>
       <w:keepLines/>
-      <w:spacing w:before="240" w:after="120"/>
+      <w:spacing w:before="240" w:after="0"/>
       <w:outlineLvl w:val="0"/>
     </w:pPr>
     <w:rPr>
-      <w:rFonts w:asciiTheme="majorHAnsi" w:eastAsiaTheme="majorEastAsia" w:hAnsiTheme="majorHAnsi" w:cstheme="majorBidi" w:ascii="Calibri" w:hAnsi="Calibri"/>
+      <w:rFonts w:asciiTheme="majorHAnsi" w:eastAsiaTheme="majorEastAsia" w:hAnsiTheme="majorHAnsi" w:cstheme="majorBidi" w:ascii="Times New Roman" w:hAnsi="Times New Roman"/>
       <w:b/>
       <w:bCs/>
-      <w:color w:val="166C62"/>
-      <w:sz w:val="30"/>
+      <w:color w:val="000000"/>
+      <w:sz w:val="24"/>
       <w:szCs w:val="28"/>
     </w:rPr>
   </w:style>
@@ -3471,14 +3432,14 @@
     <w:pPr>
       <w:keepNext/>
       <w:keepLines/>
-      <w:spacing w:before="240" w:after="120"/>
+      <w:spacing w:before="240" w:after="0"/>
       <w:outlineLvl w:val="1"/>
     </w:pPr>
     <w:rPr>
-      <w:rFonts w:asciiTheme="majorHAnsi" w:eastAsiaTheme="majorEastAsia" w:hAnsiTheme="majorHAnsi" w:cstheme="majorBidi" w:ascii="Calibri" w:hAnsi="Calibri"/>
+      <w:rFonts w:asciiTheme="majorHAnsi" w:eastAsiaTheme="majorEastAsia" w:hAnsiTheme="majorHAnsi" w:cstheme="majorBidi" w:ascii="Times New Roman" w:hAnsi="Times New Roman"/>
       <w:b/>
       <w:bCs/>
-      <w:color w:val="166C62"/>
+      <w:color w:val="000000"/>
       <w:sz w:val="24"/>
       <w:szCs w:val="26"/>
     </w:rPr>
@@ -3737,15 +3698,16 @@
       <w:pBdr>
         <w:bottom w:val="single" w:sz="8" w:space="4" w:color="4F81BD" w:themeColor="accent1"/>
       </w:pBdr>
-      <w:spacing w:after="120" w:line="240" w:lineRule="auto" w:before="0"/>
+      <w:spacing w:after="0" w:line="240" w:lineRule="auto" w:before="240"/>
       <w:contextualSpacing/>
     </w:pPr>
     <w:rPr>
-      <w:rFonts w:asciiTheme="majorHAnsi" w:eastAsiaTheme="majorEastAsia" w:hAnsiTheme="majorHAnsi" w:cstheme="majorBidi" w:ascii="Calibri" w:hAnsi="Calibri"/>
-      <w:color w:val="166C62"/>
+      <w:rFonts w:asciiTheme="majorHAnsi" w:eastAsiaTheme="majorEastAsia" w:hAnsiTheme="majorHAnsi" w:cstheme="majorBidi" w:ascii="Times New Roman" w:hAnsi="Times New Roman"/>
+      <w:b/>
+      <w:color w:val="000000"/>
       <w:spacing w:val="5"/>
       <w:kern w:val="28"/>
-      <w:sz w:val="40"/>
+      <w:sz w:val="24"/>
       <w:szCs w:val="52"/>
     </w:rPr>
   </w:style>
@@ -4183,10 +4145,12 @@
       <w:spacing w:line="240" w:lineRule="auto"/>
     </w:pPr>
     <w:rPr>
+      <w:rFonts w:ascii="Times New Roman" w:hAnsi="Times New Roman"/>
       <w:b/>
       <w:bCs/>
-      <w:color w:val="425564"/>
-      <w:sz w:val="18"/>
+      <w:i w:val="0"/>
+      <w:color w:val="000000"/>
+      <w:sz w:val="24"/>
       <w:szCs w:val="18"/>
     </w:rPr>
   </w:style>

</xml_diff>

<commit_message>
Double-space the plain manuscript
Most journals ask for double-spaced submissions so reviewers can annotate.
Body text, headings and captions are now 2.0 in plain mode.

Table cells stay single-spaced: double spacing inside a table wastes pages
without helping a reviewer, and journals do not ask for it there.

Verified: Normal, Heading and Caption styles all at 2.0, body paragraphs
inheriting it, 40 and 175 table cells at 1.0, and the documents still carry one
font with no non-black text and no shading.

Co-Authored-By: Claude Opus 5 <noreply@anthropic.com>
</commit_message>
<xml_diff>
--- a/paper/SARscope_MolInf_manuscript.docx
+++ b/paper/SARscope_MolInf_manuscript.docx
@@ -538,7 +538,7 @@
           </w:tcPr>
           <w:p>
             <w:pPr>
-              <w:spacing w:after="80" w:before="80" w:line="252" w:lineRule="auto"/>
+              <w:spacing w:after="80" w:before="80" w:line="240" w:lineRule="auto"/>
               <w:jc w:val="left"/>
             </w:pPr>
             <w:r>
@@ -557,7 +557,7 @@
           </w:tcPr>
           <w:p>
             <w:pPr>
-              <w:spacing w:after="80" w:before="80" w:line="252" w:lineRule="auto"/>
+              <w:spacing w:after="80" w:before="80" w:line="240" w:lineRule="auto"/>
               <w:jc w:val="center"/>
             </w:pPr>
             <w:r>
@@ -576,7 +576,7 @@
           </w:tcPr>
           <w:p>
             <w:pPr>
-              <w:spacing w:after="80" w:before="80" w:line="252" w:lineRule="auto"/>
+              <w:spacing w:after="80" w:before="80" w:line="240" w:lineRule="auto"/>
               <w:jc w:val="center"/>
             </w:pPr>
             <w:r>
@@ -595,7 +595,7 @@
           </w:tcPr>
           <w:p>
             <w:pPr>
-              <w:spacing w:after="80" w:before="80" w:line="252" w:lineRule="auto"/>
+              <w:spacing w:after="80" w:before="80" w:line="240" w:lineRule="auto"/>
               <w:jc w:val="center"/>
             </w:pPr>
             <w:r>
@@ -614,7 +614,7 @@
           </w:tcPr>
           <w:p>
             <w:pPr>
-              <w:spacing w:after="80" w:before="80" w:line="252" w:lineRule="auto"/>
+              <w:spacing w:after="80" w:before="80" w:line="240" w:lineRule="auto"/>
               <w:jc w:val="center"/>
             </w:pPr>
             <w:r>
@@ -638,7 +638,7 @@
           </w:tcPr>
           <w:p>
             <w:pPr>
-              <w:spacing w:after="80" w:before="80" w:line="252" w:lineRule="auto"/>
+              <w:spacing w:after="80" w:before="80" w:line="240" w:lineRule="auto"/>
               <w:jc w:val="left"/>
             </w:pPr>
             <w:r>
@@ -656,7 +656,7 @@
           </w:tcPr>
           <w:p>
             <w:pPr>
-              <w:spacing w:after="80" w:before="80" w:line="252" w:lineRule="auto"/>
+              <w:spacing w:after="80" w:before="80" w:line="240" w:lineRule="auto"/>
               <w:jc w:val="center"/>
             </w:pPr>
             <w:r>
@@ -674,7 +674,7 @@
           </w:tcPr>
           <w:p>
             <w:pPr>
-              <w:spacing w:after="80" w:before="80" w:line="252" w:lineRule="auto"/>
+              <w:spacing w:after="80" w:before="80" w:line="240" w:lineRule="auto"/>
               <w:jc w:val="center"/>
             </w:pPr>
             <w:r>
@@ -692,7 +692,7 @@
           </w:tcPr>
           <w:p>
             <w:pPr>
-              <w:spacing w:after="80" w:before="80" w:line="252" w:lineRule="auto"/>
+              <w:spacing w:after="80" w:before="80" w:line="240" w:lineRule="auto"/>
               <w:jc w:val="center"/>
             </w:pPr>
             <w:r>
@@ -710,7 +710,7 @@
           </w:tcPr>
           <w:p>
             <w:pPr>
-              <w:spacing w:after="80" w:before="80" w:line="252" w:lineRule="auto"/>
+              <w:spacing w:after="80" w:before="80" w:line="240" w:lineRule="auto"/>
               <w:jc w:val="center"/>
             </w:pPr>
             <w:r>
@@ -733,7 +733,7 @@
           </w:tcPr>
           <w:p>
             <w:pPr>
-              <w:spacing w:after="80" w:before="80" w:line="252" w:lineRule="auto"/>
+              <w:spacing w:after="80" w:before="80" w:line="240" w:lineRule="auto"/>
               <w:jc w:val="left"/>
             </w:pPr>
             <w:r>
@@ -751,7 +751,7 @@
           </w:tcPr>
           <w:p>
             <w:pPr>
-              <w:spacing w:after="80" w:before="80" w:line="252" w:lineRule="auto"/>
+              <w:spacing w:after="80" w:before="80" w:line="240" w:lineRule="auto"/>
               <w:jc w:val="center"/>
             </w:pPr>
             <w:r>
@@ -769,7 +769,7 @@
           </w:tcPr>
           <w:p>
             <w:pPr>
-              <w:spacing w:after="80" w:before="80" w:line="252" w:lineRule="auto"/>
+              <w:spacing w:after="80" w:before="80" w:line="240" w:lineRule="auto"/>
               <w:jc w:val="center"/>
             </w:pPr>
             <w:r>
@@ -787,7 +787,7 @@
           </w:tcPr>
           <w:p>
             <w:pPr>
-              <w:spacing w:after="80" w:before="80" w:line="252" w:lineRule="auto"/>
+              <w:spacing w:after="80" w:before="80" w:line="240" w:lineRule="auto"/>
               <w:jc w:val="center"/>
             </w:pPr>
             <w:r>
@@ -805,7 +805,7 @@
           </w:tcPr>
           <w:p>
             <w:pPr>
-              <w:spacing w:after="80" w:before="80" w:line="252" w:lineRule="auto"/>
+              <w:spacing w:after="80" w:before="80" w:line="240" w:lineRule="auto"/>
               <w:jc w:val="center"/>
             </w:pPr>
             <w:r>
@@ -828,7 +828,7 @@
           </w:tcPr>
           <w:p>
             <w:pPr>
-              <w:spacing w:after="80" w:before="80" w:line="252" w:lineRule="auto"/>
+              <w:spacing w:after="80" w:before="80" w:line="240" w:lineRule="auto"/>
               <w:jc w:val="left"/>
             </w:pPr>
             <w:r>
@@ -846,7 +846,7 @@
           </w:tcPr>
           <w:p>
             <w:pPr>
-              <w:spacing w:after="80" w:before="80" w:line="252" w:lineRule="auto"/>
+              <w:spacing w:after="80" w:before="80" w:line="240" w:lineRule="auto"/>
               <w:jc w:val="center"/>
             </w:pPr>
             <w:r>
@@ -864,7 +864,7 @@
           </w:tcPr>
           <w:p>
             <w:pPr>
-              <w:spacing w:after="80" w:before="80" w:line="252" w:lineRule="auto"/>
+              <w:spacing w:after="80" w:before="80" w:line="240" w:lineRule="auto"/>
               <w:jc w:val="center"/>
             </w:pPr>
             <w:r>
@@ -882,7 +882,7 @@
           </w:tcPr>
           <w:p>
             <w:pPr>
-              <w:spacing w:after="80" w:before="80" w:line="252" w:lineRule="auto"/>
+              <w:spacing w:after="80" w:before="80" w:line="240" w:lineRule="auto"/>
               <w:jc w:val="center"/>
             </w:pPr>
             <w:r>
@@ -900,7 +900,7 @@
           </w:tcPr>
           <w:p>
             <w:pPr>
-              <w:spacing w:after="80" w:before="80" w:line="252" w:lineRule="auto"/>
+              <w:spacing w:after="80" w:before="80" w:line="240" w:lineRule="auto"/>
               <w:jc w:val="center"/>
             </w:pPr>
             <w:r>
@@ -1053,7 +1053,7 @@
           </w:tcPr>
           <w:p>
             <w:pPr>
-              <w:spacing w:after="80" w:before="80" w:line="252" w:lineRule="auto"/>
+              <w:spacing w:after="80" w:before="80" w:line="240" w:lineRule="auto"/>
               <w:jc w:val="left"/>
             </w:pPr>
             <w:r>
@@ -1072,7 +1072,7 @@
           </w:tcPr>
           <w:p>
             <w:pPr>
-              <w:spacing w:after="80" w:before="80" w:line="252" w:lineRule="auto"/>
+              <w:spacing w:after="80" w:before="80" w:line="240" w:lineRule="auto"/>
               <w:jc w:val="center"/>
             </w:pPr>
             <w:r>
@@ -1091,7 +1091,7 @@
           </w:tcPr>
           <w:p>
             <w:pPr>
-              <w:spacing w:after="80" w:before="80" w:line="252" w:lineRule="auto"/>
+              <w:spacing w:after="80" w:before="80" w:line="240" w:lineRule="auto"/>
               <w:jc w:val="center"/>
             </w:pPr>
             <w:r>
@@ -1110,7 +1110,7 @@
           </w:tcPr>
           <w:p>
             <w:pPr>
-              <w:spacing w:after="80" w:before="80" w:line="252" w:lineRule="auto"/>
+              <w:spacing w:after="80" w:before="80" w:line="240" w:lineRule="auto"/>
               <w:jc w:val="center"/>
             </w:pPr>
             <w:r>
@@ -1134,7 +1134,7 @@
           </w:tcPr>
           <w:p>
             <w:pPr>
-              <w:spacing w:after="80" w:before="80" w:line="252" w:lineRule="auto"/>
+              <w:spacing w:after="80" w:before="80" w:line="240" w:lineRule="auto"/>
               <w:jc w:val="left"/>
             </w:pPr>
             <w:r>
@@ -1152,7 +1152,7 @@
           </w:tcPr>
           <w:p>
             <w:pPr>
-              <w:spacing w:after="80" w:before="80" w:line="252" w:lineRule="auto"/>
+              <w:spacing w:after="80" w:before="80" w:line="240" w:lineRule="auto"/>
               <w:jc w:val="center"/>
             </w:pPr>
             <w:r>
@@ -1170,7 +1170,7 @@
           </w:tcPr>
           <w:p>
             <w:pPr>
-              <w:spacing w:after="80" w:before="80" w:line="252" w:lineRule="auto"/>
+              <w:spacing w:after="80" w:before="80" w:line="240" w:lineRule="auto"/>
               <w:jc w:val="center"/>
             </w:pPr>
             <w:r>
@@ -1188,7 +1188,7 @@
           </w:tcPr>
           <w:p>
             <w:pPr>
-              <w:spacing w:after="80" w:before="80" w:line="252" w:lineRule="auto"/>
+              <w:spacing w:after="80" w:before="80" w:line="240" w:lineRule="auto"/>
               <w:jc w:val="center"/>
             </w:pPr>
             <w:r>
@@ -1211,7 +1211,7 @@
           </w:tcPr>
           <w:p>
             <w:pPr>
-              <w:spacing w:after="80" w:before="80" w:line="252" w:lineRule="auto"/>
+              <w:spacing w:after="80" w:before="80" w:line="240" w:lineRule="auto"/>
               <w:jc w:val="left"/>
             </w:pPr>
             <w:r>
@@ -1229,7 +1229,7 @@
           </w:tcPr>
           <w:p>
             <w:pPr>
-              <w:spacing w:after="80" w:before="80" w:line="252" w:lineRule="auto"/>
+              <w:spacing w:after="80" w:before="80" w:line="240" w:lineRule="auto"/>
               <w:jc w:val="center"/>
             </w:pPr>
             <w:r>
@@ -1247,7 +1247,7 @@
           </w:tcPr>
           <w:p>
             <w:pPr>
-              <w:spacing w:after="80" w:before="80" w:line="252" w:lineRule="auto"/>
+              <w:spacing w:after="80" w:before="80" w:line="240" w:lineRule="auto"/>
               <w:jc w:val="center"/>
             </w:pPr>
             <w:r>
@@ -1265,7 +1265,7 @@
           </w:tcPr>
           <w:p>
             <w:pPr>
-              <w:spacing w:after="80" w:before="80" w:line="252" w:lineRule="auto"/>
+              <w:spacing w:after="80" w:before="80" w:line="240" w:lineRule="auto"/>
               <w:jc w:val="center"/>
             </w:pPr>
             <w:r>
@@ -1288,7 +1288,7 @@
           </w:tcPr>
           <w:p>
             <w:pPr>
-              <w:spacing w:after="80" w:before="80" w:line="252" w:lineRule="auto"/>
+              <w:spacing w:after="80" w:before="80" w:line="240" w:lineRule="auto"/>
               <w:jc w:val="left"/>
             </w:pPr>
             <w:r>
@@ -1306,7 +1306,7 @@
           </w:tcPr>
           <w:p>
             <w:pPr>
-              <w:spacing w:after="80" w:before="80" w:line="252" w:lineRule="auto"/>
+              <w:spacing w:after="80" w:before="80" w:line="240" w:lineRule="auto"/>
               <w:jc w:val="center"/>
             </w:pPr>
             <w:r>
@@ -1324,7 +1324,7 @@
           </w:tcPr>
           <w:p>
             <w:pPr>
-              <w:spacing w:after="80" w:before="80" w:line="252" w:lineRule="auto"/>
+              <w:spacing w:after="80" w:before="80" w:line="240" w:lineRule="auto"/>
               <w:jc w:val="center"/>
             </w:pPr>
             <w:r>
@@ -1342,7 +1342,7 @@
           </w:tcPr>
           <w:p>
             <w:pPr>
-              <w:spacing w:after="80" w:before="80" w:line="252" w:lineRule="auto"/>
+              <w:spacing w:after="80" w:before="80" w:line="240" w:lineRule="auto"/>
               <w:jc w:val="center"/>
             </w:pPr>
             <w:r>
@@ -1365,7 +1365,7 @@
           </w:tcPr>
           <w:p>
             <w:pPr>
-              <w:spacing w:after="80" w:before="80" w:line="252" w:lineRule="auto"/>
+              <w:spacing w:after="80" w:before="80" w:line="240" w:lineRule="auto"/>
               <w:jc w:val="left"/>
             </w:pPr>
             <w:r>
@@ -1383,7 +1383,7 @@
           </w:tcPr>
           <w:p>
             <w:pPr>
-              <w:spacing w:after="80" w:before="80" w:line="252" w:lineRule="auto"/>
+              <w:spacing w:after="80" w:before="80" w:line="240" w:lineRule="auto"/>
               <w:jc w:val="center"/>
             </w:pPr>
             <w:r>
@@ -1401,7 +1401,7 @@
           </w:tcPr>
           <w:p>
             <w:pPr>
-              <w:spacing w:after="80" w:before="80" w:line="252" w:lineRule="auto"/>
+              <w:spacing w:after="80" w:before="80" w:line="240" w:lineRule="auto"/>
               <w:jc w:val="center"/>
             </w:pPr>
             <w:r>
@@ -1419,7 +1419,7 @@
           </w:tcPr>
           <w:p>
             <w:pPr>
-              <w:spacing w:after="80" w:before="80" w:line="252" w:lineRule="auto"/>
+              <w:spacing w:after="80" w:before="80" w:line="240" w:lineRule="auto"/>
               <w:jc w:val="center"/>
             </w:pPr>
             <w:r>
@@ -3345,7 +3345,7 @@
     <w:rsid w:val="00FC693F"/>
     <w:pPr>
       <w:widowControl/>
-      <w:spacing w:line="240" w:lineRule="auto" w:after="0" w:before="0"/>
+      <w:spacing w:line="480" w:lineRule="auto" w:after="0" w:before="0"/>
     </w:pPr>
     <w:rPr>
       <w:rFonts w:ascii="Times New Roman" w:hAnsi="Times New Roman"/>
@@ -3408,7 +3408,7 @@
     <w:pPr>
       <w:keepNext/>
       <w:keepLines/>
-      <w:spacing w:before="240" w:after="0"/>
+      <w:spacing w:before="240" w:after="0" w:line="480" w:lineRule="auto"/>
       <w:outlineLvl w:val="0"/>
     </w:pPr>
     <w:rPr>
@@ -3432,7 +3432,7 @@
     <w:pPr>
       <w:keepNext/>
       <w:keepLines/>
-      <w:spacing w:before="240" w:after="0"/>
+      <w:spacing w:before="240" w:after="0" w:line="480" w:lineRule="auto"/>
       <w:outlineLvl w:val="1"/>
     </w:pPr>
     <w:rPr>
@@ -3698,7 +3698,7 @@
       <w:pBdr>
         <w:bottom w:val="single" w:sz="8" w:space="4" w:color="4F81BD" w:themeColor="accent1"/>
       </w:pBdr>
-      <w:spacing w:after="0" w:line="240" w:lineRule="auto" w:before="240"/>
+      <w:spacing w:after="0" w:line="480" w:lineRule="auto" w:before="240"/>
       <w:contextualSpacing/>
     </w:pPr>
     <w:rPr>
@@ -4142,7 +4142,7 @@
     <w:qFormat/>
     <w:rsid w:val="00FC693F"/>
     <w:pPr>
-      <w:spacing w:line="240" w:lineRule="auto"/>
+      <w:spacing w:line="480" w:lineRule="auto"/>
     </w:pPr>
     <w:rPr>
       <w:rFonts w:ascii="Times New Roman" w:hAnsi="Times New Roman"/>

</xml_diff>

<commit_message>
Remove the title rule and the dot separators
Two bits of decoration that read as styling rather than manuscript.

Word's default Title style carries a blue bottom border, which drew a line
under the title. It lives in the style definition rather than on the
paragraph, so an earlier audit of document.xml missed it and no inline
formatting would have removed it; plain mode now overrides it explicitly.

The header line and the keyword list used middle dots as separators. The
header is now a sentence and the keywords are semicolon-separated, which is
what the journal's own keyword field expects anyway.

IntenseQuote still carries a border from the default template but is applied
nowhere in either document.

Co-Authored-By: Claude Opus 5 <noreply@anthropic.com>
</commit_message>
<xml_diff>
--- a/paper/SARscope_MolInf_manuscript.docx
+++ b/paper/SARscope_MolInf_manuscript.docx
@@ -27,7 +27,7 @@
     </w:p>
     <w:p>
       <w:r>
-        <w:t>Molecular Informatics · software and methods draft. Author declarations require confirmation before submission.</w:t>
+        <w:t>Submitted to Molecular Informatics as a software and methods article. Author declarations require confirmation before submission.</w:t>
       </w:r>
     </w:p>
     <w:p>
@@ -79,7 +79,7 @@
         <w:t>Keywords:</w:t>
       </w:r>
       <w:r>
-        <w:t xml:space="preserve"> structure–activity relationships · matched molecular pairs · activity cliffs · chemoinformatics · assay comparability</w:t>
+        <w:t xml:space="preserve"> structure–activity relationships; matched molecular pairs; activity cliffs; chemoinformatics; assay comparability</w:t>
       </w:r>
     </w:p>
     <w:p>
@@ -3410,6 +3410,13 @@
       <w:keepLines/>
       <w:spacing w:before="240" w:after="0" w:line="480" w:lineRule="auto"/>
       <w:outlineLvl w:val="0"/>
+      <w:pBdr>
+        <w:top w:val="none" w:sz="0" w:space="0"/>
+        <w:left w:val="none" w:sz="0" w:space="0"/>
+        <w:bottom w:val="none" w:sz="0" w:space="0"/>
+        <w:right w:val="none" w:sz="0" w:space="0"/>
+        <w:between w:val="none" w:sz="0" w:space="0"/>
+      </w:pBdr>
     </w:pPr>
     <w:rPr>
       <w:rFonts w:asciiTheme="majorHAnsi" w:eastAsiaTheme="majorEastAsia" w:hAnsiTheme="majorHAnsi" w:cstheme="majorBidi" w:ascii="Times New Roman" w:hAnsi="Times New Roman"/>
@@ -3434,6 +3441,13 @@
       <w:keepLines/>
       <w:spacing w:before="240" w:after="0" w:line="480" w:lineRule="auto"/>
       <w:outlineLvl w:val="1"/>
+      <w:pBdr>
+        <w:top w:val="none" w:sz="0" w:space="0"/>
+        <w:left w:val="none" w:sz="0" w:space="0"/>
+        <w:bottom w:val="none" w:sz="0" w:space="0"/>
+        <w:right w:val="none" w:sz="0" w:space="0"/>
+        <w:between w:val="none" w:sz="0" w:space="0"/>
+      </w:pBdr>
     </w:pPr>
     <w:rPr>
       <w:rFonts w:asciiTheme="majorHAnsi" w:eastAsiaTheme="majorEastAsia" w:hAnsiTheme="majorHAnsi" w:cstheme="majorBidi" w:ascii="Times New Roman" w:hAnsi="Times New Roman"/>
@@ -3694,12 +3708,16 @@
     <w:qFormat/>
     <w:rsid w:val="00FC693F"/>
     <w:pPr>
+      <w:spacing w:after="0" w:line="480" w:lineRule="auto" w:before="240"/>
+      <w:contextualSpacing/>
       <w:keepNext/>
       <w:pBdr>
-        <w:bottom w:val="single" w:sz="8" w:space="4" w:color="4F81BD" w:themeColor="accent1"/>
+        <w:top w:val="none" w:sz="0" w:space="0"/>
+        <w:left w:val="none" w:sz="0" w:space="0"/>
+        <w:bottom w:val="none" w:sz="0" w:space="0"/>
+        <w:right w:val="none" w:sz="0" w:space="0"/>
+        <w:between w:val="none" w:sz="0" w:space="0"/>
       </w:pBdr>
-      <w:spacing w:after="0" w:line="480" w:lineRule="auto" w:before="240"/>
-      <w:contextualSpacing/>
     </w:pPr>
     <w:rPr>
       <w:rFonts w:asciiTheme="majorHAnsi" w:eastAsiaTheme="majorEastAsia" w:hAnsiTheme="majorHAnsi" w:cstheme="majorBidi" w:ascii="Times New Roman" w:hAnsi="Times New Roman"/>

</xml_diff>